<commit_message>
Receive updated templates with revised placeholder structures from user
</commit_message>
<xml_diff>
--- a/public/1. Mẫu 1. Don xin chuyen dang.docx
+++ b/public/1. Mẫu 1. Don xin chuyen dang.docx
@@ -662,7 +662,15 @@
           <w:sz w:val="28"/>
           <w:szCs w:val="28"/>
         </w:rPr>
-        <w:t>{{Họ và tên Đảng viên}}</w:t>
+        <w:t>Lê Vĩnh Diện</w:t>
+      </w:r>
+      <w:r>
+        <w:rPr>
+          <w:color w:val="000000"/>
+          <w:sz w:val="28"/>
+          <w:szCs w:val="28"/>
+        </w:rPr>
+        <w:tab/>
       </w:r>
       <w:r>
         <w:rPr>
@@ -703,6 +711,14 @@
           <w:sz w:val="28"/>
           <w:szCs w:val="28"/>
         </w:rPr>
+        <w:tab/>
+      </w:r>
+      <w:r>
+        <w:rPr>
+          <w:color w:val="000000"/>
+          <w:sz w:val="28"/>
+          <w:szCs w:val="28"/>
+        </w:rPr>
         <w:t>Giới tính:</w:t>
       </w:r>
       <w:r>
@@ -711,31 +727,7 @@
           <w:sz w:val="28"/>
           <w:szCs w:val="28"/>
         </w:rPr>
-        <w:t xml:space="preserve"> </w:t>
-      </w:r>
-      <w:r>
-        <w:rPr>
-          <w:color w:val="000000"/>
-          <w:sz w:val="28"/>
-          <w:szCs w:val="28"/>
-        </w:rPr>
-        <w:t>{{</w:t>
-      </w:r>
-      <w:r>
-        <w:rPr>
-          <w:color w:val="000000"/>
-          <w:sz w:val="28"/>
-          <w:szCs w:val="28"/>
-        </w:rPr>
-        <w:t>Giới tính</w:t>
-      </w:r>
-      <w:r>
-        <w:rPr>
-          <w:color w:val="000000"/>
-          <w:sz w:val="28"/>
-          <w:szCs w:val="28"/>
-        </w:rPr>
-        <w:t xml:space="preserve"> của Đảng viên}}</w:t>
+        <w:t xml:space="preserve"> Nam</w:t>
       </w:r>
     </w:p>
     <w:p>
@@ -770,31 +762,7 @@
           <w:sz w:val="28"/>
           <w:szCs w:val="28"/>
         </w:rPr>
-        <w:t>{{</w:t>
-      </w:r>
-      <w:r>
-        <w:rPr>
-          <w:color w:val="000000"/>
-          <w:sz w:val="28"/>
-          <w:szCs w:val="28"/>
-        </w:rPr>
-        <w:t>Ngày tháng năm sinh của</w:t>
-      </w:r>
-      <w:r>
-        <w:rPr>
-          <w:color w:val="000000"/>
-          <w:sz w:val="28"/>
-          <w:szCs w:val="28"/>
-        </w:rPr>
-        <w:t xml:space="preserve"> Đảng viên}}</w:t>
-      </w:r>
-      <w:r>
-        <w:rPr>
-          <w:color w:val="000000"/>
-          <w:sz w:val="28"/>
-          <w:szCs w:val="28"/>
-        </w:rPr>
-        <w:tab/>
+        <w:t>01/04/2004</w:t>
       </w:r>
     </w:p>
     <w:p>
@@ -829,39 +797,7 @@
           <w:sz w:val="28"/>
           <w:szCs w:val="28"/>
         </w:rPr>
-        <w:t>{{</w:t>
-      </w:r>
-      <w:r>
-        <w:rPr>
-          <w:color w:val="000000"/>
-          <w:sz w:val="28"/>
-          <w:szCs w:val="28"/>
-        </w:rPr>
-        <w:t>Quê quán</w:t>
-      </w:r>
-      <w:r>
-        <w:rPr>
-          <w:color w:val="000000"/>
-          <w:sz w:val="28"/>
-          <w:szCs w:val="28"/>
-        </w:rPr>
-        <w:t xml:space="preserve"> của</w:t>
-      </w:r>
-      <w:r>
-        <w:rPr>
-          <w:color w:val="000000"/>
-          <w:sz w:val="28"/>
-          <w:szCs w:val="28"/>
-        </w:rPr>
-        <w:t xml:space="preserve"> Đảng viên}}</w:t>
-      </w:r>
-      <w:r>
-        <w:rPr>
-          <w:color w:val="000000"/>
-          <w:sz w:val="28"/>
-          <w:szCs w:val="28"/>
-        </w:rPr>
-        <w:tab/>
+        <w:t>Xã Vĩnh Thủy, tỉnh Quảng Trị</w:t>
       </w:r>
     </w:p>
     <w:p>
@@ -896,39 +832,7 @@
           <w:sz w:val="28"/>
           <w:szCs w:val="28"/>
         </w:rPr>
-        <w:t>{{</w:t>
-      </w:r>
-      <w:r>
-        <w:rPr>
-          <w:color w:val="000000"/>
-          <w:sz w:val="28"/>
-          <w:szCs w:val="28"/>
-        </w:rPr>
-        <w:t>Nơi ở hiện nay</w:t>
-      </w:r>
-      <w:r>
-        <w:rPr>
-          <w:color w:val="000000"/>
-          <w:sz w:val="28"/>
-          <w:szCs w:val="28"/>
-        </w:rPr>
-        <w:t xml:space="preserve"> của</w:t>
-      </w:r>
-      <w:r>
-        <w:rPr>
-          <w:color w:val="000000"/>
-          <w:sz w:val="28"/>
-          <w:szCs w:val="28"/>
-        </w:rPr>
-        <w:t xml:space="preserve"> Đảng viên}}</w:t>
-      </w:r>
-      <w:r>
-        <w:rPr>
-          <w:color w:val="000000"/>
-          <w:sz w:val="28"/>
-          <w:szCs w:val="28"/>
-        </w:rPr>
-        <w:tab/>
+        <w:t xml:space="preserve">Thôn Đức Xá, Xã Vĩnh Thủy, tỉnh Quảng Trị </w:t>
       </w:r>
     </w:p>
     <w:p>
@@ -963,39 +867,7 @@
           <w:sz w:val="28"/>
           <w:szCs w:val="28"/>
         </w:rPr>
-        <w:t>{{</w:t>
-      </w:r>
-      <w:r>
-        <w:rPr>
-          <w:color w:val="000000"/>
-          <w:sz w:val="28"/>
-          <w:szCs w:val="28"/>
-        </w:rPr>
-        <w:t xml:space="preserve">Ngày </w:t>
-      </w:r>
-      <w:r>
-        <w:rPr>
-          <w:color w:val="000000"/>
-          <w:sz w:val="28"/>
-          <w:szCs w:val="28"/>
-        </w:rPr>
-        <w:t xml:space="preserve">vào Đảng </w:t>
-      </w:r>
-      <w:r>
-        <w:rPr>
-          <w:color w:val="000000"/>
-          <w:sz w:val="28"/>
-          <w:szCs w:val="28"/>
-        </w:rPr>
-        <w:t>của</w:t>
-      </w:r>
-      <w:r>
-        <w:rPr>
-          <w:color w:val="000000"/>
-          <w:sz w:val="28"/>
-          <w:szCs w:val="28"/>
-        </w:rPr>
-        <w:t xml:space="preserve"> Đảng viên}}</w:t>
+        <w:t>26/07/2022</w:t>
       </w:r>
       <w:r>
         <w:rPr>
@@ -1035,55 +907,7 @@
           <w:sz w:val="28"/>
           <w:szCs w:val="28"/>
         </w:rPr>
-        <w:t>{{</w:t>
-      </w:r>
-      <w:r>
-        <w:rPr>
-          <w:color w:val="000000"/>
-          <w:sz w:val="28"/>
-          <w:szCs w:val="28"/>
-        </w:rPr>
-        <w:t xml:space="preserve">Ngày </w:t>
-      </w:r>
-      <w:r>
-        <w:rPr>
-          <w:color w:val="000000"/>
-          <w:sz w:val="28"/>
-          <w:szCs w:val="28"/>
-        </w:rPr>
-        <w:t>chính thức</w:t>
-      </w:r>
-      <w:r>
-        <w:rPr>
-          <w:color w:val="000000"/>
-          <w:sz w:val="28"/>
-          <w:szCs w:val="28"/>
-        </w:rPr>
-        <w:t xml:space="preserve"> của</w:t>
-      </w:r>
-      <w:r>
-        <w:rPr>
-          <w:color w:val="000000"/>
-          <w:sz w:val="28"/>
-          <w:szCs w:val="28"/>
-        </w:rPr>
-        <w:t xml:space="preserve"> Đảng viên</w:t>
-      </w:r>
-      <w:r>
-        <w:rPr>
-          <w:color w:val="000000"/>
-          <w:sz w:val="28"/>
-          <w:szCs w:val="28"/>
-        </w:rPr>
-        <w:t xml:space="preserve"> nếu có</w:t>
-      </w:r>
-      <w:r>
-        <w:rPr>
-          <w:color w:val="000000"/>
-          <w:sz w:val="28"/>
-          <w:szCs w:val="28"/>
-        </w:rPr>
-        <w:t>}}</w:t>
+        <w:t>26/07/2023</w:t>
       </w:r>
     </w:p>
     <w:p>
@@ -1118,47 +942,15 @@
           <w:sz w:val="28"/>
           <w:szCs w:val="28"/>
         </w:rPr>
-        <w:t>{{</w:t>
-      </w:r>
-      <w:r>
-        <w:rPr>
-          <w:color w:val="000000"/>
-          <w:sz w:val="28"/>
-          <w:szCs w:val="28"/>
-        </w:rPr>
-        <w:t>Số thẻ Đảng</w:t>
-      </w:r>
-      <w:r>
-        <w:rPr>
-          <w:color w:val="000000"/>
-          <w:sz w:val="28"/>
-          <w:szCs w:val="28"/>
-        </w:rPr>
-        <w:t xml:space="preserve"> của</w:t>
-      </w:r>
-      <w:r>
-        <w:rPr>
-          <w:color w:val="000000"/>
-          <w:sz w:val="28"/>
-          <w:szCs w:val="28"/>
-        </w:rPr>
-        <w:t xml:space="preserve"> Đảng viên</w:t>
-      </w:r>
-      <w:r>
-        <w:rPr>
-          <w:color w:val="000000"/>
-          <w:sz w:val="28"/>
-          <w:szCs w:val="28"/>
-        </w:rPr>
-        <w:t xml:space="preserve"> nếu có</w:t>
-      </w:r>
-      <w:r>
-        <w:rPr>
-          <w:color w:val="000000"/>
-          <w:sz w:val="28"/>
-          <w:szCs w:val="28"/>
-        </w:rPr>
-        <w:t>}}</w:t>
+        <w:t>045204008389</w:t>
+      </w:r>
+      <w:r>
+        <w:rPr>
+          <w:color w:val="000000"/>
+          <w:sz w:val="28"/>
+          <w:szCs w:val="28"/>
+        </w:rPr>
+        <w:tab/>
       </w:r>
       <w:r>
         <w:rPr>
@@ -1190,39 +982,7 @@
           <w:sz w:val="28"/>
           <w:szCs w:val="28"/>
         </w:rPr>
-        <w:t>{{</w:t>
-      </w:r>
-      <w:r>
-        <w:rPr>
-          <w:color w:val="000000"/>
-          <w:sz w:val="28"/>
-          <w:szCs w:val="28"/>
-        </w:rPr>
-        <w:t>Số điện thọa</w:t>
-      </w:r>
-      <w:r>
-        <w:rPr>
-          <w:color w:val="000000"/>
-          <w:sz w:val="28"/>
-          <w:szCs w:val="28"/>
-        </w:rPr>
-        <w:t>i</w:t>
-      </w:r>
-      <w:r>
-        <w:rPr>
-          <w:color w:val="000000"/>
-          <w:sz w:val="28"/>
-          <w:szCs w:val="28"/>
-        </w:rPr>
-        <w:t xml:space="preserve"> của</w:t>
-      </w:r>
-      <w:r>
-        <w:rPr>
-          <w:color w:val="000000"/>
-          <w:sz w:val="28"/>
-          <w:szCs w:val="28"/>
-        </w:rPr>
-        <w:t xml:space="preserve"> Đảng viên}}</w:t>
+        <w:t>0969754149</w:t>
       </w:r>
     </w:p>
     <w:p>
@@ -1257,23 +1017,7 @@
           <w:sz w:val="28"/>
           <w:szCs w:val="28"/>
         </w:rPr>
-        <w:t xml:space="preserve">{{Nhiệm vụ </w:t>
-      </w:r>
-      <w:r>
-        <w:rPr>
-          <w:color w:val="000000"/>
-          <w:sz w:val="28"/>
-          <w:szCs w:val="28"/>
-        </w:rPr>
-        <w:t>Đảng</w:t>
-      </w:r>
-      <w:r>
-        <w:rPr>
-          <w:color w:val="000000"/>
-          <w:sz w:val="28"/>
-          <w:szCs w:val="28"/>
-        </w:rPr>
-        <w:t xml:space="preserve"> được giao}}</w:t>
+        <w:t>Đảng viên, Phó bí thư Chi bộ Sinh viên</w:t>
       </w:r>
     </w:p>
     <w:p>
@@ -2313,6 +2057,7 @@
   <w:style w:type="character" w:default="1" w:styleId="DefaultParagraphFont">
     <w:name w:val="Default Paragraph Font"/>
     <w:uiPriority w:val="1"/>
+    <w:semiHidden/>
     <w:unhideWhenUsed/>
   </w:style>
   <w:style w:type="table" w:default="1" w:styleId="TableNormal">

</xml_diff>